<commit_message>
chore: sanitize user guide builder and regenerate .docx files
Automated pre-push sanitization on build_user_guides.py (2 term
replacements). Regenerated both .docx guides from the sanitized source.

Co-Authored-By: Jeremy Randall <jeremy134@gmail.com>
</commit_message>
<xml_diff>
--- a/docs/EVAL_GUI_USER_GUIDE.docx
+++ b/docs/EVAL_GUI_USER_GUIDE.docx
@@ -20,7 +20,7 @@
           <w:i w:val="0"/>
           <w:sz w:val="22"/>
         </w:rPr>
-        <w:t>Version: 2026-04-15  |  Generated: 2026-04-15 22:14</w:t>
+        <w:t>Version: 2026-04-15  |  Generated: 2026-04-15 22:16</w:t>
       </w:r>
     </w:p>
     <w:p>
@@ -1224,7 +1224,7 @@
           <w:i w:val="0"/>
           <w:sz w:val="22"/>
         </w:rPr>
-        <w:t>RAGAS metrics come in two variants. LLM-based metrics use a judge model (such as GPT-4 or Claude) to evaluate semantic quality -- these require API access and incur cost. Non-LLM metrics use algorithmic approaches (Levenshtein distance, fuzzy matching via rapidfuzz) to measure retrieval quality without any external API calls.</w:t>
+        <w:t>RAGAS metrics come in two variants. LLM-based metrics use a judge model (such as GPT-4 or CoPilot+) to evaluate semantic quality -- these require API access and incur cost. Non-LLM metrics use algorithmic approaches (Levenshtein distance, fuzzy matching via rapidfuzz) to measure retrieval quality without any external API calls.</w:t>
       </w:r>
     </w:p>
     <w:p>
@@ -1266,7 +1266,7 @@
           <w:i w:val="0"/>
           <w:sz w:val="22"/>
         </w:rPr>
-        <w:t>These are the correct choice for offline evaluation, air-gapped environments, and cost-controlled testing. LLM-based Faithfulness and Answer Relevancy require a judge model API and are a planned future enhancement for connected environments.</w:t>
+        <w:t>These are the correct choice for offline evaluation, offline environments, and cost-controlled testing. LLM-based Faithfulness and Answer Relevancy require a judge model API and are a planned future enhancement for connected environments.</w:t>
       </w:r>
     </w:p>
     <w:p>
@@ -1611,7 +1611,7 @@
                 <w:b w:val="0"/>
                 <w:sz w:val="20"/>
               </w:rPr>
-              <w:t>Requires external API (GPT-4/Claude). Measures claim-level grounding.</w:t>
+              <w:t>Requires external API (GPT-4/CoPilot+). Measures claim-level grounding.</w:t>
             </w:r>
           </w:p>
         </w:tc>

</xml_diff>